<commit_message>
Update project files for Ver2 split fastframe
</commit_message>
<xml_diff>
--- a/research_paper_structure_maxwell_demon_drosophila.docx
+++ b/research_paper_structure_maxwell_demon_drosophila.docx
@@ -16,31 +16,27 @@
     </w:p>
     <w:p>
       <w:pPr>
-        <w:jc w:val="center"/>
-      </w:pPr>
-      <w:hyperlink r:id="rId6" w:history="1">
-        <w:r>
-          <w:rPr>
-            <w:rStyle w:val="Hyperlink"/>
-            <w:i/>
-            <w:sz w:val="24"/>
-          </w:rPr>
-          <w:t>Yash.sharma@qub.ac.uk</w:t>
-        </w:r>
-      </w:hyperlink>
+        <w:ind w:left="4320"/>
+      </w:pPr>
       <w:r>
         <w:rPr>
           <w:i/>
           <w:sz w:val="24"/>
         </w:rPr>
-        <w:t xml:space="preserve"> </w:t>
+        <w:t xml:space="preserve"> (email)</w:t>
       </w:r>
     </w:p>
     <w:p>
       <w:pPr>
         <w:pStyle w:val="Heading1"/>
-      </w:pPr>
-      <w:r>
+        <w:rPr>
+          <w:lang w:val="fr-FR"/>
+        </w:rPr>
+      </w:pPr>
+      <w:r>
+        <w:rPr>
+          <w:lang w:val="fr-FR"/>
+        </w:rPr>
         <w:t>Document Purpose</w:t>
       </w:r>
     </w:p>

</xml_diff>